<commit_message>
Worked on flutter CI/CD
</commit_message>
<xml_diff>
--- a/f16_flutter_CLI_&_common_issues_documentary.docx
+++ b/f16_flutter_CLI_&_common_issues_documentary.docx
@@ -2369,12 +2369,18 @@
       <w:pPr>
         <w:jc w:val="both"/>
         <w:rPr>
-          <w:sz w:val="32"/>
-          <w:szCs w:val="32"/>
-        </w:rPr>
-      </w:pPr>
-      <w:r>
-        <w:rPr>
+          <w:b/>
+          <w:bCs/>
+          <w:color w:val="60CAF3" w:themeColor="accent4" w:themeTint="99"/>
+          <w:sz w:val="32"/>
+          <w:szCs w:val="32"/>
+        </w:rPr>
+      </w:pPr>
+      <w:r>
+        <w:rPr>
+          <w:b/>
+          <w:bCs/>
+          <w:color w:val="60CAF3" w:themeColor="accent4" w:themeTint="99"/>
           <w:sz w:val="32"/>
           <w:szCs w:val="32"/>
         </w:rPr>
@@ -2535,29 +2541,7 @@
           <w:sz w:val="32"/>
           <w:szCs w:val="32"/>
         </w:rPr>
-        <w:t xml:space="preserve">dart run </w:t>
-      </w:r>
-      <w:proofErr w:type="spellStart"/>
-      <w:r>
-        <w:rPr>
-          <w:b/>
-          <w:bCs/>
-          <w:color w:val="60CAF3" w:themeColor="accent4" w:themeTint="99"/>
-          <w:sz w:val="32"/>
-          <w:szCs w:val="32"/>
-        </w:rPr>
-        <w:t>build_runner</w:t>
-      </w:r>
-      <w:proofErr w:type="spellEnd"/>
-      <w:r>
-        <w:rPr>
-          <w:b/>
-          <w:bCs/>
-          <w:color w:val="60CAF3" w:themeColor="accent4" w:themeTint="99"/>
-          <w:sz w:val="32"/>
-          <w:szCs w:val="32"/>
-        </w:rPr>
-        <w:t xml:space="preserve"> build</w:t>
+        <w:t>dart run build_runner build</w:t>
       </w:r>
     </w:p>
     <w:p>
@@ -2777,29 +2761,7 @@
           <w:sz w:val="32"/>
           <w:szCs w:val="32"/>
         </w:rPr>
-        <w:t xml:space="preserve">dart run </w:t>
-      </w:r>
-      <w:proofErr w:type="spellStart"/>
-      <w:r>
-        <w:rPr>
-          <w:b/>
-          <w:bCs/>
-          <w:color w:val="60CAF3" w:themeColor="accent4" w:themeTint="99"/>
-          <w:sz w:val="32"/>
-          <w:szCs w:val="32"/>
-        </w:rPr>
-        <w:t>build_runner</w:t>
-      </w:r>
-      <w:proofErr w:type="spellEnd"/>
-      <w:r>
-        <w:rPr>
-          <w:b/>
-          <w:bCs/>
-          <w:color w:val="60CAF3" w:themeColor="accent4" w:themeTint="99"/>
-          <w:sz w:val="32"/>
-          <w:szCs w:val="32"/>
-        </w:rPr>
-        <w:t xml:space="preserve"> build</w:t>
+        <w:t>dart run build_runner build</w:t>
       </w:r>
     </w:p>
     <w:p>
@@ -2844,29 +2806,7 @@
           <w:sz w:val="32"/>
           <w:szCs w:val="32"/>
         </w:rPr>
-        <w:t xml:space="preserve">dart run </w:t>
-      </w:r>
-      <w:proofErr w:type="spellStart"/>
-      <w:r>
-        <w:rPr>
-          <w:b/>
-          <w:bCs/>
-          <w:color w:val="60CAF3" w:themeColor="accent4" w:themeTint="99"/>
-          <w:sz w:val="32"/>
-          <w:szCs w:val="32"/>
-        </w:rPr>
-        <w:t>build_runner</w:t>
-      </w:r>
-      <w:proofErr w:type="spellEnd"/>
-      <w:r>
-        <w:rPr>
-          <w:b/>
-          <w:bCs/>
-          <w:color w:val="60CAF3" w:themeColor="accent4" w:themeTint="99"/>
-          <w:sz w:val="32"/>
-          <w:szCs w:val="32"/>
-        </w:rPr>
-        <w:t xml:space="preserve"> watch</w:t>
+        <w:t>dart run build_runner watch</w:t>
       </w:r>
     </w:p>
     <w:p>
@@ -2908,29 +2848,7 @@
           <w:sz w:val="32"/>
           <w:szCs w:val="32"/>
         </w:rPr>
-        <w:t xml:space="preserve">dart run </w:t>
-      </w:r>
-      <w:proofErr w:type="spellStart"/>
-      <w:r>
-        <w:rPr>
-          <w:b/>
-          <w:bCs/>
-          <w:color w:val="60CAF3" w:themeColor="accent4" w:themeTint="99"/>
-          <w:sz w:val="32"/>
-          <w:szCs w:val="32"/>
-        </w:rPr>
-        <w:t>build_runner</w:t>
-      </w:r>
-      <w:proofErr w:type="spellEnd"/>
-      <w:r>
-        <w:rPr>
-          <w:b/>
-          <w:bCs/>
-          <w:color w:val="60CAF3" w:themeColor="accent4" w:themeTint="99"/>
-          <w:sz w:val="32"/>
-          <w:szCs w:val="32"/>
-        </w:rPr>
-        <w:t xml:space="preserve"> build --delete-conflicting-outputs</w:t>
+        <w:t>dart run build_runner build --delete-conflicting-outputs</w:t>
       </w:r>
     </w:p>
     <w:p>
@@ -8446,6 +8364,7 @@
   <w:style w:type="character" w:default="1" w:styleId="DefaultParagraphFont">
     <w:name w:val="Default Paragraph Font"/>
     <w:uiPriority w:val="1"/>
+    <w:semiHidden/>
     <w:unhideWhenUsed/>
   </w:style>
   <w:style w:type="table" w:default="1" w:styleId="TableNormal">

</xml_diff>